<commit_message>
docs: punto 4 actualizado — zonas autoadministrables desde el panel de settings
Co-Authored-By: Claude Fable 5 <noreply@anthropic.com>
</commit_message>
<xml_diff>
--- a/docs/evals/Revision_Inventario_DePaseoEnFincas.docx
+++ b/docs/evals/Revision_Inventario_DePaseoEnFincas.docx
@@ -3114,12 +3114,12 @@
           <w:i w:val="false"/>
           <w:iCs w:val="false"/>
         </w:rPr>
-        <w:t xml:space="preserve">4. Regla de oro para el futuro</w:t>
+        <w:t xml:space="preserve">4. Regla de oro para el futuro: las zonas se administran desde el panel</w:t>
       </w:r>
     </w:p>
     <w:p>
       <w:pPr>
-        <w:spacing w:after="240"/>
+        <w:spacing w:after="120"/>
       </w:pPr>
       <w:r>
         <w:rPr>
@@ -3128,7 +3128,86 @@
           <w:i w:val="false"/>
           <w:iCs w:val="false"/>
         </w:rPr>
-        <w:t xml:space="preserve">Cuando se agregue una zona nueva al archivo (un municipio donde antes no había fincas), avisarnos para registrarla también en la configuración del asistente. Así el bot la reconoce de inmediato y nunca dice "no tenemos propiedades ahí" por error. (Esto fue lo que pasó con La Mesa, Melgar y Arbeláez — ya quedó corregido.)</w:t>
+        <w:t xml:space="preserve">Las zonas de cobertura que el asistente comunica a los clientes ya las pueden editar ustedes mismos, sin depender de nadie:</w:t>
+      </w:r>
+    </w:p>
+    <w:p>
+      <w:pPr>
+        <w:pStyle w:val="ListParagraph"/>
+        <w:numPr>
+          <w:ilvl w:val="0"/>
+          <w:numId w:val="4"/>
+        </w:numPr>
+        <w:spacing w:after="60"/>
+      </w:pPr>
+      <w:r>
+        <w:rPr>
+          <w:sz w:val="22"/>
+          <w:szCs w:val="22"/>
+        </w:rPr>
+        <w:t xml:space="preserve">Entrar al panel: de-paseo-en-fincas.vercel.app/settings</w:t>
+      </w:r>
+    </w:p>
+    <w:p>
+      <w:pPr>
+        <w:pStyle w:val="ListParagraph"/>
+        <w:numPr>
+          <w:ilvl w:val="0"/>
+          <w:numId w:val="4"/>
+        </w:numPr>
+        <w:spacing w:after="60"/>
+      </w:pPr>
+      <w:r>
+        <w:rPr>
+          <w:sz w:val="22"/>
+          <w:szCs w:val="22"/>
+        </w:rPr>
+        <w:t xml:space="preserve">Buscar el campo "Zonas que quieres comunicar como cobertura".</w:t>
+      </w:r>
+    </w:p>
+    <w:p>
+      <w:pPr>
+        <w:pStyle w:val="ListParagraph"/>
+        <w:numPr>
+          <w:ilvl w:val="0"/>
+          <w:numId w:val="4"/>
+        </w:numPr>
+        <w:spacing w:after="120"/>
+      </w:pPr>
+      <w:r>
+        <w:rPr>
+          <w:sz w:val="22"/>
+          <w:szCs w:val="22"/>
+        </w:rPr>
+        <w:t xml:space="preserve">Editar la lista (ej: agregar el municipio nuevo) y guardar.</w:t>
+      </w:r>
+    </w:p>
+    <w:p>
+      <w:pPr>
+        <w:spacing w:after="120"/>
+      </w:pPr>
+      <w:r>
+        <w:rPr>
+          <w:b w:val="false"/>
+          <w:bCs w:val="false"/>
+          <w:i w:val="false"/>
+          <w:iCs w:val="false"/>
+        </w:rPr>
+        <w:t xml:space="preserve">El cambio aplica de inmediato — el asistente usa la lista nueva desde el siguiente mensaje.</w:t>
+      </w:r>
+    </w:p>
+    <w:p>
+      <w:pPr>
+        <w:spacing w:after="240"/>
+      </w:pPr>
+      <w:r>
+        <w:rPr>
+          <w:b w:val="false"/>
+          <w:bCs w:val="false"/>
+          <w:i w:val="false"/>
+          <w:iCs w:val="false"/>
+        </w:rPr>
+        <w:t xml:space="preserve">Cuándo usarlo: cada vez que se agregue una zona nueva al archivo de propiedades (un municipio donde antes no había fincas), agregarla también en ese campo del panel. Así el bot la reconoce de inmediato y nunca dice "no tenemos propiedades ahí" por error. (Esto fue lo que pasó con La Mesa, Melgar y Arbeláez — ya quedó corregido y la lista actual está completa.)</w:t>
       </w:r>
     </w:p>
     <w:p>
@@ -3377,6 +3456,18 @@
       </w:pPr>
     </w:lvl>
   </w:abstractNum>
+  <w:abstractNum w:abstractNumId="4" w15:restartNumberingAfterBreak="0">
+    <w:multiLevelType w:val="hybridMultilevel"/>
+    <w:lvl w:ilvl="0" w15:tentative="1">
+      <w:start w:val="1"/>
+      <w:numFmt w:val="decimal"/>
+      <w:lvlText w:val="%1."/>
+      <w:lvlJc w:val="left"/>
+      <w:pPr>
+        <w:ind w:left="720" w:hanging="360"/>
+      </w:pPr>
+    </w:lvl>
+  </w:abstractNum>
   <w:num w:numId="1">
     <w:abstractNumId w:val="1"/>
     <w:lvlOverride w:ilvl="0">
@@ -3391,6 +3482,12 @@
   </w:num>
   <w:num w:numId="3">
     <w:abstractNumId w:val="2"/>
+    <w:lvlOverride w:ilvl="0">
+      <w:startOverride w:val="1"/>
+    </w:lvlOverride>
+  </w:num>
+  <w:num w:numId="4">
+    <w:abstractNumId w:val="4"/>
     <w:lvlOverride w:ilvl="0">
       <w:startOverride w:val="1"/>
     </w:lvlOverride>

</xml_diff>